<commit_message>
Update to signout return address
</commit_message>
<xml_diff>
--- a/Change log/BEFORE NAV BAR.docx
+++ b/Change log/BEFORE NAV BAR.docx
@@ -86,6 +86,9 @@
     </w:p>
     <w:p>
       <w:r>
+        <w:rPr>
+          <w:noProof/>
+        </w:rPr>
         <w:drawing>
           <wp:inline distT="0" distB="0" distL="0" distR="0" wp14:anchorId="551C4DFB" wp14:editId="78D88AD3">
             <wp:extent cx="5731510" cy="2972435"/>
@@ -129,6 +132,52 @@
         <w:t>Changed from current requests to outstanding requests</w:t>
       </w:r>
     </w:p>
+    <w:p/>
+    <w:p>
+      <w:r>
+        <w:drawing>
+          <wp:inline distT="0" distB="0" distL="0" distR="0" wp14:anchorId="6C44957B" wp14:editId="4C3DC07A">
+            <wp:extent cx="5731510" cy="2944495"/>
+            <wp:effectExtent l="0" t="0" r="2540" b="8255"/>
+            <wp:docPr id="166217386" name="Picture 1"/>
+            <wp:cNvGraphicFramePr>
+              <a:graphicFrameLocks xmlns:a="http://schemas.openxmlformats.org/drawingml/2006/main" noChangeAspect="1"/>
+            </wp:cNvGraphicFramePr>
+            <a:graphic xmlns:a="http://schemas.openxmlformats.org/drawingml/2006/main">
+              <a:graphicData uri="http://schemas.openxmlformats.org/drawingml/2006/picture">
+                <pic:pic xmlns:pic="http://schemas.openxmlformats.org/drawingml/2006/picture">
+                  <pic:nvPicPr>
+                    <pic:cNvPr id="166217386" name=""/>
+                    <pic:cNvPicPr/>
+                  </pic:nvPicPr>
+                  <pic:blipFill>
+                    <a:blip r:embed="rId7"/>
+                    <a:stretch>
+                      <a:fillRect/>
+                    </a:stretch>
+                  </pic:blipFill>
+                  <pic:spPr>
+                    <a:xfrm>
+                      <a:off x="0" y="0"/>
+                      <a:ext cx="5731510" cy="2944495"/>
+                    </a:xfrm>
+                    <a:prstGeom prst="rect">
+                      <a:avLst/>
+                    </a:prstGeom>
+                  </pic:spPr>
+                </pic:pic>
+              </a:graphicData>
+            </a:graphic>
+          </wp:inline>
+        </w:drawing>
+      </w:r>
+    </w:p>
+    <w:p>
+      <w:r>
+        <w:t>Architecture restructure where database retrieves the relevant requests.</w:t>
+      </w:r>
+    </w:p>
+    <w:p/>
     <w:sectPr>
       <w:pgSz w:w="11906" w:h="16838"/>
       <w:pgMar w:top="1440" w:right="1440" w:bottom="1440" w:left="1440" w:header="708" w:footer="708" w:gutter="0"/>

</xml_diff>